<commit_message>
Regenerate himservice KP_HIMSERVICE.docx - full template
</commit_message>
<xml_diff>
--- a/clients/himservice/KP_HIMSERVICE.docx
+++ b/clients/himservice/KP_HIMSERVICE.docx
@@ -8,14 +8,37 @@
       </w:pPr>
       <w:r>
         <w:rPr>
+          <w:rFonts w:ascii="Times New Roman" w:hAnsi="Times New Roman"/>
+          <w:b/>
+          <w:sz w:val="22"/>
+        </w:rPr>
+        <w:t>КОНСАЛТИНГОВАЯ КОМПАНИЯ</w:t>
+        <w:br/>
+        <w:t>ANDROMEDA CONSULT</w:t>
+      </w:r>
+    </w:p>
+    <w:p>
+      <w:pPr>
+        <w:jc w:val="right"/>
+      </w:pPr>
+      <w:r>
+        <w:rPr>
+          <w:rFonts w:ascii="Times New Roman" w:hAnsi="Times New Roman"/>
           <w:color w:val="667788"/>
           <w:sz w:val="16"/>
         </w:rPr>
-        <w:t>КОНСАЛТИНГОВАЯ КОМПАНИЯ ANDROMEDA CONSULT</w:t>
+        <w:t>ИНН 7702464831  |  ОГРН 1197746181038  |  КПП 770201001</w:t>
         <w:br/>
-        <w:t>ИНН 7702464831 | ОГРН 1197746181038 | КПП 770201001</w:t>
-        <w:br/>
-        <w:t>info@andromedaconsult.ru | andromedaconsult.ru</w:t>
+        <w:t>info@andromedaconsult.ru  |  andromedaconsult.ru  |  @andromedaconsult</w:t>
+      </w:r>
+    </w:p>
+    <w:p>
+      <w:r>
+        <w:rPr>
+          <w:color w:val="CCCCCC"/>
+          <w:sz w:val="12"/>
+        </w:rPr>
+        <w:t>────────────────────────────────────────────────────────────────────────────────</w:t>
       </w:r>
     </w:p>
     <w:p>
@@ -24,9 +47,11 @@
       </w:pPr>
       <w:r>
         <w:rPr>
+          <w:rFonts w:ascii="Times New Roman" w:hAnsi="Times New Roman"/>
           <w:b/>
-          <w:sz w:val="28"/>
+          <w:sz w:val="32"/>
         </w:rPr>
+        <w:br/>
         <w:t>КОММЕРЧЕСКОЕ ПРЕДЛОЖЕНИЕ</w:t>
       </w:r>
     </w:p>
@@ -36,279 +61,836 @@
       </w:pPr>
       <w:r>
         <w:rPr>
-          <w:sz w:val="20"/>
+          <w:rFonts w:ascii="Times New Roman" w:hAnsi="Times New Roman"/>
+          <w:sz w:val="22"/>
         </w:rPr>
-        <w:t>на получение статуса резидента Фонда «Сколково»</w:t>
+        <w:t>ООО «Химсервис» · ИНН 7743149719 · г. Москва</w:t>
       </w:r>
     </w:p>
-    <w:p/>
     <w:p>
+      <w:pPr>
+        <w:jc w:val="center"/>
+      </w:pPr>
       <w:r>
         <w:rPr>
-          <w:b/>
+          <w:rFonts w:ascii="Times New Roman" w:hAnsi="Times New Roman"/>
+          <w:sz w:val="18"/>
         </w:rPr>
-        <w:t xml:space="preserve">Клиент: </w:t>
-      </w:r>
-      <w:r>
-        <w:t>ООО «ХИМСЕРВИС» (ИНН 7743149719)</w:t>
+        <w:t>15 июля 2026 г.</w:t>
       </w:r>
     </w:p>
     <w:p>
       <w:r>
         <w:rPr>
-          <w:b/>
+          <w:color w:val="CCCCCC"/>
+          <w:sz w:val="12"/>
         </w:rPr>
-        <w:t xml:space="preserve">Руководитель: </w:t>
-      </w:r>
-      <w:r>
-        <w:t>Диков Олег Станиславович</w:t>
+        <w:t>────────────────────────────────────────────────────────────────────────────────</w:t>
       </w:r>
     </w:p>
-    <w:p/>
     <w:p>
+      <w:pPr>
+        <w:spacing w:after="80"/>
+      </w:pPr>
       <w:r>
         <w:rPr>
-          <w:b/>
-          <w:sz w:val="24"/>
+          <w:rFonts w:ascii="Times New Roman" w:hAnsi="Times New Roman"/>
+          <w:b w:val="0"/>
+          <w:sz w:val="20"/>
         </w:rPr>
-        <w:t>1. Текущее состояние</w:t>
+        <w:t>Консалтинговая компания «Андромеда консалтинг» предлагает ООО «Химсервис» подготовить пакет документов для участия в следующих программах и направлениях:</w:t>
       </w:r>
     </w:p>
-    <w:tbl>
-      <w:tblPr>
-        <w:tblStyle w:val="TableGrid"/>
-        <w:tblW w:type="auto" w:w="0"/>
-        <w:tblLook w:firstColumn="1" w:firstRow="1" w:lastColumn="0" w:lastRow="0" w:noHBand="0" w:noVBand="1" w:val="04A0"/>
-      </w:tblPr>
-      <w:tblGrid>
-        <w:gridCol w:w="2880"/>
-        <w:gridCol w:w="2880"/>
-        <w:gridCol w:w="2880"/>
-      </w:tblGrid>
-      <w:tr>
-        <w:tc>
-          <w:tcPr>
-            <w:tcW w:type="dxa" w:w="2880"/>
-          </w:tcPr>
-          <w:p>
-            <w:r>
-              <w:t>Показатель</w:t>
-            </w:r>
-          </w:p>
-        </w:tc>
-        <w:tc>
-          <w:tcPr>
-            <w:tcW w:type="dxa" w:w="2880"/>
-          </w:tcPr>
-          <w:p>
-            <w:r>
-              <w:t>2025</w:t>
-            </w:r>
-          </w:p>
-        </w:tc>
-        <w:tc>
-          <w:tcPr>
-            <w:tcW w:type="dxa" w:w="2880"/>
-          </w:tcPr>
-          <w:p>
-            <w:r>
-              <w:t>Примечание</w:t>
-            </w:r>
-          </w:p>
-        </w:tc>
-      </w:tr>
-      <w:tr>
-        <w:tc>
-          <w:tcPr>
-            <w:tcW w:type="dxa" w:w="2880"/>
-          </w:tcPr>
-          <w:p>
-            <w:r>
-              <w:t>Выручка</w:t>
-            </w:r>
-          </w:p>
-        </w:tc>
-        <w:tc>
-          <w:tcPr>
-            <w:tcW w:type="dxa" w:w="2880"/>
-          </w:tcPr>
-          <w:p>
-            <w:r>
-              <w:t>547 млн ₽</w:t>
-            </w:r>
-          </w:p>
-        </w:tc>
-        <w:tc>
-          <w:tcPr>
-            <w:tcW w:type="dxa" w:w="2880"/>
-          </w:tcPr>
-          <w:p>
-            <w:r>
-              <w:t>Рост +34%</w:t>
-            </w:r>
-          </w:p>
-        </w:tc>
-      </w:tr>
-      <w:tr>
-        <w:tc>
-          <w:tcPr>
-            <w:tcW w:type="dxa" w:w="2880"/>
-          </w:tcPr>
-          <w:p>
-            <w:r>
-              <w:t>Прибыль</w:t>
-            </w:r>
-          </w:p>
-        </w:tc>
-        <w:tc>
-          <w:tcPr>
-            <w:tcW w:type="dxa" w:w="2880"/>
-          </w:tcPr>
-          <w:p>
-            <w:r>
-              <w:t>29,3 млн ₽</w:t>
-            </w:r>
-          </w:p>
-        </w:tc>
-        <w:tc>
-          <w:tcPr>
-            <w:tcW w:type="dxa" w:w="2880"/>
-          </w:tcPr>
-          <w:p>
-            <w:r/>
-          </w:p>
-        </w:tc>
-      </w:tr>
-      <w:tr>
-        <w:tc>
-          <w:tcPr>
-            <w:tcW w:type="dxa" w:w="2880"/>
-          </w:tcPr>
-          <w:p>
-            <w:r>
-              <w:t>ОКВЭД</w:t>
-            </w:r>
-          </w:p>
-        </w:tc>
-        <w:tc>
-          <w:tcPr>
-            <w:tcW w:type="dxa" w:w="2880"/>
-          </w:tcPr>
-          <w:p>
-            <w:r>
-              <w:t>20.41</w:t>
-            </w:r>
-          </w:p>
-        </w:tc>
-        <w:tc>
-          <w:tcPr>
-            <w:tcW w:type="dxa" w:w="2880"/>
-          </w:tcPr>
-          <w:p>
-            <w:r>
-              <w:t>Производство мыла и моющих</w:t>
-            </w:r>
-          </w:p>
-        </w:tc>
-      </w:tr>
-      <w:tr>
-        <w:tc>
-          <w:tcPr>
-            <w:tcW w:type="dxa" w:w="2880"/>
-          </w:tcPr>
-          <w:p>
-            <w:r>
-              <w:t>Режим</w:t>
-            </w:r>
-          </w:p>
-        </w:tc>
-        <w:tc>
-          <w:tcPr>
-            <w:tcW w:type="dxa" w:w="2880"/>
-          </w:tcPr>
-          <w:p>
-            <w:r>
-              <w:t>ОСН</w:t>
-            </w:r>
-          </w:p>
-        </w:tc>
-        <w:tc>
-          <w:tcPr>
-            <w:tcW w:type="dxa" w:w="2880"/>
-          </w:tcPr>
-          <w:p>
-            <w:r/>
-          </w:p>
-        </w:tc>
-      </w:tr>
-      <w:tr>
-        <w:tc>
-          <w:tcPr>
-            <w:tcW w:type="dxa" w:w="2880"/>
-          </w:tcPr>
-          <w:p>
-            <w:r>
-              <w:t>Сотрудники</w:t>
-            </w:r>
-          </w:p>
-        </w:tc>
-        <w:tc>
-          <w:tcPr>
-            <w:tcW w:type="dxa" w:w="2880"/>
-          </w:tcPr>
-          <w:p>
-            <w:r>
-              <w:t>~25 чел.</w:t>
-            </w:r>
-          </w:p>
-        </w:tc>
-        <w:tc>
-          <w:tcPr>
-            <w:tcW w:type="dxa" w:w="2880"/>
-          </w:tcPr>
-          <w:p>
-            <w:r>
-              <w:t>Оценка</w:t>
-            </w:r>
-          </w:p>
-        </w:tc>
-      </w:tr>
-    </w:tbl>
-    <w:p/>
     <w:p>
+      <w:pPr>
+        <w:spacing w:after="80"/>
+      </w:pPr>
       <w:r>
         <w:rPr>
-          <w:b/>
-          <w:sz w:val="24"/>
+          <w:rFonts w:ascii="Times New Roman" w:hAnsi="Times New Roman"/>
+          <w:b w:val="0"/>
+          <w:sz w:val="20"/>
         </w:rPr>
-        <w:t>2. Налоговая экономия</w:t>
+        <w:t>• получение статуса Участника «Сколково»;</w:t>
+      </w:r>
+    </w:p>
+    <w:p>
+      <w:pPr>
+        <w:spacing w:after="80"/>
+      </w:pPr>
+      <w:r>
+        <w:rPr>
+          <w:rFonts w:ascii="Times New Roman" w:hAnsi="Times New Roman"/>
+          <w:b w:val="0"/>
+          <w:sz w:val="20"/>
+        </w:rPr>
+        <w:t>• включение в реестр Малых технологических компаний (МТК);</w:t>
+      </w:r>
+    </w:p>
+    <w:p>
+      <w:pPr>
+        <w:spacing w:after="80"/>
+      </w:pPr>
+      <w:r>
+        <w:rPr>
+          <w:rFonts w:ascii="Times New Roman" w:hAnsi="Times New Roman"/>
+          <w:b w:val="0"/>
+          <w:sz w:val="20"/>
+        </w:rPr>
+        <w:t>• получение в приоритетном порядке патента на полезную модель.</w:t>
       </w:r>
     </w:p>
     <w:p>
       <w:r>
         <w:rPr>
-          <w:sz w:val="20"/>
+          <w:rFonts w:ascii="Times New Roman" w:hAnsi="Times New Roman"/>
+          <w:b/>
+          <w:sz w:val="24"/>
         </w:rPr>
-        <w:t>• Налог на прибыль 0% — экономия ~5,86 млн ₽/год</w:t>
         <w:br/>
-        <w:t>• Страховые взносы 15% — экономия ~1,6 млн ₽/год</w:t>
-        <w:br/>
-        <w:t>• Освобождение от налога на имущество</w:t>
-        <w:br/>
-        <w:br/>
-        <w:t>Итого годовая экономия: ~7,5 млн ₽</w:t>
-        <w:br/>
-        <w:t>Прогноз на 10 лет: ~75 млн ₽</w:t>
+        <w:t>1. СТАТУС УЧАСТНИКА «СКОЛКОВО»</w:t>
       </w:r>
     </w:p>
-    <w:p/>
     <w:p>
       <w:r>
         <w:rPr>
+          <w:color w:val="CCCCCC"/>
+          <w:sz w:val="12"/>
+        </w:rPr>
+        <w:t>──────────────────────────────────────────────────────────────────────</w:t>
+      </w:r>
+    </w:p>
+    <w:p>
+      <w:pPr>
+        <w:spacing w:after="80"/>
+      </w:pPr>
+      <w:r>
+        <w:rPr>
+          <w:rFonts w:ascii="Times New Roman" w:hAnsi="Times New Roman"/>
+          <w:b w:val="0"/>
+          <w:sz w:val="20"/>
+        </w:rPr>
+        <w:t>Для выявления возможности получения Вашей компанией налоговых преференций мы предлагаем провести анализ деятельности и подготовить заявку на получение статуса Участника Сколково. Резиденты ОЭЗ «Сколково» получают на 10 лет следующие налоговые льготы и поддержку:</w:t>
+      </w:r>
+    </w:p>
+    <w:p>
+      <w:pPr>
+        <w:spacing w:after="80"/>
+      </w:pPr>
+      <w:r>
+        <w:rPr>
+          <w:rFonts w:ascii="Times New Roman" w:hAnsi="Times New Roman"/>
+          <w:b w:val="0"/>
+          <w:sz w:val="20"/>
+        </w:rPr>
+        <w:t>• Льгота по налогу на прибыль — 0%</w:t>
+      </w:r>
+    </w:p>
+    <w:p>
+      <w:pPr>
+        <w:spacing w:after="80"/>
+      </w:pPr>
+      <w:r>
+        <w:rPr>
+          <w:rFonts w:ascii="Times New Roman" w:hAnsi="Times New Roman"/>
+          <w:b w:val="0"/>
+          <w:sz w:val="20"/>
+        </w:rPr>
+        <w:t>• Пониженные страховые взносы — 15%</w:t>
+      </w:r>
+    </w:p>
+    <w:p>
+      <w:pPr>
+        <w:spacing w:after="80"/>
+      </w:pPr>
+      <w:r>
+        <w:rPr>
+          <w:rFonts w:ascii="Times New Roman" w:hAnsi="Times New Roman"/>
+          <w:b w:val="0"/>
+          <w:sz w:val="20"/>
+        </w:rPr>
+        <w:t>• Льгота на налог на имущество — 0%</w:t>
+      </w:r>
+    </w:p>
+    <w:p>
+      <w:pPr>
+        <w:spacing w:after="80"/>
+      </w:pPr>
+      <w:r>
+        <w:rPr>
+          <w:rFonts w:ascii="Times New Roman" w:hAnsi="Times New Roman"/>
+          <w:b w:val="0"/>
+          <w:sz w:val="20"/>
+        </w:rPr>
+        <w:t>• Льготы по уплате таможенных платежей</w:t>
+      </w:r>
+    </w:p>
+    <w:p>
+      <w:pPr>
+        <w:spacing w:after="80"/>
+      </w:pPr>
+      <w:r>
+        <w:rPr>
+          <w:rFonts w:ascii="Times New Roman" w:hAnsi="Times New Roman"/>
+          <w:b w:val="0"/>
+          <w:sz w:val="20"/>
+        </w:rPr>
+        <w:t>• Визово-миграционные льготы</w:t>
+      </w:r>
+    </w:p>
+    <w:p>
+      <w:pPr>
+        <w:spacing w:after="80"/>
+      </w:pPr>
+      <w:r>
+        <w:rPr>
+          <w:rFonts w:ascii="Times New Roman" w:hAnsi="Times New Roman"/>
+          <w:b w:val="0"/>
+          <w:sz w:val="20"/>
+        </w:rPr>
+        <w:t>• Финансовая поддержка: гранты от 1,5 до 50 млн ₽</w:t>
+      </w:r>
+    </w:p>
+    <w:p>
+      <w:r>
+        <w:rPr>
+          <w:rFonts w:ascii="Times New Roman" w:hAnsi="Times New Roman"/>
           <w:b/>
           <w:sz w:val="24"/>
         </w:rPr>
-        <w:t>3. Стоимость услуг</w:t>
+        <w:br/>
+        <w:t>2. РЕЕСТР МАЛЫХ ТЕХНОЛОГИЧЕСКИХ КОМПАНИЙ (МТК)</w:t>
+      </w:r>
+    </w:p>
+    <w:p>
+      <w:r>
+        <w:rPr>
+          <w:color w:val="CCCCCC"/>
+          <w:sz w:val="12"/>
+        </w:rPr>
+        <w:t>──────────────────────────────────────────────────────────────────────</w:t>
+      </w:r>
+    </w:p>
+    <w:p>
+      <w:pPr>
+        <w:spacing w:after="80"/>
+      </w:pPr>
+      <w:r>
+        <w:rPr>
+          <w:rFonts w:ascii="Times New Roman" w:hAnsi="Times New Roman"/>
+          <w:b w:val="0"/>
+          <w:sz w:val="20"/>
+        </w:rPr>
+        <w:t>Вхождение в реестр МТК открывает доступ к следующим мерам господдержки:</w:t>
+      </w:r>
+    </w:p>
+    <w:p>
+      <w:pPr>
+        <w:spacing w:after="80"/>
+      </w:pPr>
+      <w:r>
+        <w:rPr>
+          <w:rFonts w:ascii="Times New Roman" w:hAnsi="Times New Roman"/>
+          <w:b w:val="0"/>
+          <w:sz w:val="20"/>
+        </w:rPr>
+        <w:t>• дополнительные баллы при участии в грантовых конкурсах;</w:t>
+      </w:r>
+    </w:p>
+    <w:p>
+      <w:pPr>
+        <w:spacing w:after="80"/>
+      </w:pPr>
+      <w:r>
+        <w:rPr>
+          <w:rFonts w:ascii="Times New Roman" w:hAnsi="Times New Roman"/>
+          <w:b w:val="0"/>
+          <w:sz w:val="20"/>
+        </w:rPr>
+        <w:t>• льготный займ от Корпорации МСП до 2 млрд ₽;</w:t>
+      </w:r>
+    </w:p>
+    <w:p>
+      <w:pPr>
+        <w:spacing w:after="80"/>
+      </w:pPr>
+      <w:r>
+        <w:rPr>
+          <w:rFonts w:ascii="Times New Roman" w:hAnsi="Times New Roman"/>
+          <w:b w:val="0"/>
+          <w:sz w:val="20"/>
+        </w:rPr>
+        <w:t>• упрощённая процедура защиты интеллектуальной собственности;</w:t>
+      </w:r>
+    </w:p>
+    <w:p>
+      <w:pPr>
+        <w:spacing w:after="80"/>
+      </w:pPr>
+      <w:r>
+        <w:rPr>
+          <w:rFonts w:ascii="Times New Roman" w:hAnsi="Times New Roman"/>
+          <w:b w:val="0"/>
+          <w:sz w:val="20"/>
+        </w:rPr>
+        <w:t>• сниженная ставка по промышленной ипотеке;</w:t>
+      </w:r>
+    </w:p>
+    <w:p>
+      <w:pPr>
+        <w:spacing w:after="80"/>
+      </w:pPr>
+      <w:r>
+        <w:rPr>
+          <w:rFonts w:ascii="Times New Roman" w:hAnsi="Times New Roman"/>
+          <w:b w:val="0"/>
+          <w:sz w:val="20"/>
+        </w:rPr>
+        <w:t>• пониженная ставка налога на прибыль (зависит от региона);</w:t>
+      </w:r>
+    </w:p>
+    <w:p>
+      <w:pPr>
+        <w:spacing w:after="80"/>
+      </w:pPr>
+      <w:r>
+        <w:rPr>
+          <w:rFonts w:ascii="Times New Roman" w:hAnsi="Times New Roman"/>
+          <w:b w:val="0"/>
+          <w:sz w:val="20"/>
+        </w:rPr>
+        <w:t>• размещение на «Витрине стартапов» Минэкономразвития РФ;</w:t>
+      </w:r>
+    </w:p>
+    <w:p>
+      <w:pPr>
+        <w:spacing w:after="80"/>
+      </w:pPr>
+      <w:r>
+        <w:rPr>
+          <w:rFonts w:ascii="Times New Roman" w:hAnsi="Times New Roman"/>
+          <w:b w:val="0"/>
+          <w:sz w:val="20"/>
+        </w:rPr>
+        <w:t>• поддержка спроса на инновационную продукцию и экспорт.</w:t>
+      </w:r>
+    </w:p>
+    <w:p>
+      <w:pPr>
+        <w:spacing w:after="80"/>
+      </w:pPr>
+      <w:r>
+        <w:rPr>
+          <w:rFonts w:ascii="Times New Roman" w:hAnsi="Times New Roman"/>
+          <w:b w:val="0"/>
+          <w:sz w:val="20"/>
+        </w:rPr>
+        <w:t>Данный список мер господдержки ежегодно дополняется, что расширяет возможности развития и конкуренции компаний, состоящих в реестре МТК.</w:t>
+      </w:r>
+    </w:p>
+    <w:p>
+      <w:r>
+        <w:rPr>
+          <w:rFonts w:ascii="Times New Roman" w:hAnsi="Times New Roman"/>
+          <w:b/>
+          <w:sz w:val="24"/>
+        </w:rPr>
+        <w:br/>
+        <w:t>3. ПРЕДВАРИТЕЛЬНЫЙ АНАЛИЗ КОМПАНИИ</w:t>
+      </w:r>
+    </w:p>
+    <w:p>
+      <w:r>
+        <w:rPr>
+          <w:color w:val="CCCCCC"/>
+          <w:sz w:val="12"/>
+        </w:rPr>
+        <w:t>──────────────────────────────────────────────────────────────────────</w:t>
+      </w:r>
+    </w:p>
+    <w:p>
+      <w:pPr>
+        <w:spacing w:after="80"/>
+      </w:pPr>
+      <w:r>
+        <w:rPr>
+          <w:rFonts w:ascii="Times New Roman" w:hAnsi="Times New Roman"/>
+          <w:b w:val="0"/>
+          <w:sz w:val="20"/>
+        </w:rPr>
+        <w:t>На основе открытых источников нами проведён предварительный анализ ООО «Химсервис». Ниже приведены основные данные, которые будут использованы при подготовке заявки.</w:t>
+      </w:r>
+    </w:p>
+    <w:p>
+      <w:pPr>
+        <w:spacing w:after="80"/>
+      </w:pPr>
+      <w:r>
+        <w:rPr>
+          <w:rFonts w:ascii="Times New Roman" w:hAnsi="Times New Roman"/>
+          <w:b w:val="0"/>
+          <w:sz w:val="20"/>
+        </w:rPr>
+        <w:t>Руководитель: Соколов Евгений Николаевич</w:t>
+      </w:r>
+    </w:p>
+    <w:p>
+      <w:pPr>
+        <w:spacing w:after="80"/>
+      </w:pPr>
+      <w:r>
+        <w:rPr>
+          <w:rFonts w:ascii="Times New Roman" w:hAnsi="Times New Roman"/>
+          <w:b w:val="0"/>
+          <w:sz w:val="20"/>
+        </w:rPr>
+        <w:t>ОКВЭД: 20.59 — Производство прочих химических продуктов</w:t>
+      </w:r>
+    </w:p>
+    <w:p>
+      <w:pPr>
+        <w:spacing w:after="80"/>
+      </w:pPr>
+      <w:r>
+        <w:rPr>
+          <w:rFonts w:ascii="Times New Roman" w:hAnsi="Times New Roman"/>
+          <w:b w:val="0"/>
+          <w:sz w:val="20"/>
+        </w:rPr>
+        <w:t>Выручка 2025: 547,4 млн ₽</w:t>
+      </w:r>
+    </w:p>
+    <w:p>
+      <w:pPr>
+        <w:spacing w:after="80"/>
+      </w:pPr>
+      <w:r>
+        <w:rPr>
+          <w:rFonts w:ascii="Times New Roman" w:hAnsi="Times New Roman"/>
+          <w:b w:val="0"/>
+          <w:sz w:val="20"/>
+        </w:rPr>
+        <w:t>Прибыль 2025: 5,8 млн ₽</w:t>
+      </w:r>
+    </w:p>
+    <w:p>
+      <w:pPr>
+        <w:spacing w:after="80"/>
+      </w:pPr>
+      <w:r>
+        <w:rPr>
+          <w:rFonts w:ascii="Times New Roman" w:hAnsi="Times New Roman"/>
+          <w:b w:val="0"/>
+          <w:sz w:val="20"/>
+        </w:rPr>
+        <w:t>Сотрудники: 12</w:t>
+      </w:r>
+    </w:p>
+    <w:p>
+      <w:pPr>
+        <w:spacing w:after="80"/>
+      </w:pPr>
+      <w:r>
+        <w:rPr>
+          <w:rFonts w:ascii="Times New Roman" w:hAnsi="Times New Roman"/>
+          <w:b w:val="0"/>
+          <w:sz w:val="20"/>
+        </w:rPr>
+        <w:t>Налоговый режим: ОСН</w:t>
+      </w:r>
+    </w:p>
+    <w:p>
+      <w:pPr>
+        <w:spacing w:after="80"/>
+      </w:pPr>
+      <w:r>
+        <w:rPr>
+          <w:rFonts w:ascii="Times New Roman" w:hAnsi="Times New Roman"/>
+          <w:b w:val="0"/>
+          <w:sz w:val="8"/>
+        </w:rPr>
+      </w:r>
+    </w:p>
+    <w:p>
+      <w:pPr>
+        <w:spacing w:after="80"/>
+      </w:pPr>
+      <w:r>
+        <w:rPr>
+          <w:rFonts w:ascii="Times New Roman" w:hAnsi="Times New Roman"/>
+          <w:b/>
+          <w:sz w:val="20"/>
+        </w:rPr>
+        <w:t>Прогноз налоговой экономии при статусе резидента Сколково:</w:t>
+      </w:r>
+    </w:p>
+    <w:p>
+      <w:pPr>
+        <w:spacing w:after="80"/>
+      </w:pPr>
+      <w:r>
+        <w:rPr>
+          <w:rFonts w:ascii="Times New Roman" w:hAnsi="Times New Roman"/>
+          <w:b w:val="0"/>
+          <w:sz w:val="20"/>
+        </w:rPr>
+        <w:t>• За 2024–2025: ~15 млн ₽</w:t>
+        <w:br/>
+        <w:t>• Прогноз на 10 лет: ~75 млн ₽</w:t>
+        <w:br/>
+        <w:t>• Среднегодовая: ~7,5 млн ₽</w:t>
+        <w:br/>
+        <w:t>• Каждый год промедления = ~7,5 млн ₽ упущенной экономии.</w:t>
+      </w:r>
+    </w:p>
+    <w:p>
+      <w:r>
+        <w:rPr>
+          <w:rFonts w:ascii="Times New Roman" w:hAnsi="Times New Roman"/>
+          <w:b/>
+          <w:sz w:val="24"/>
+        </w:rPr>
+        <w:br/>
+        <w:t>4. ПОРЯДОК РАБОТЫ (ДОРОЖНАЯ КАРТА)</w:t>
+      </w:r>
+    </w:p>
+    <w:p>
+      <w:r>
+        <w:rPr>
+          <w:color w:val="CCCCCC"/>
+          <w:sz w:val="12"/>
+        </w:rPr>
+        <w:t>──────────────────────────────────────────────────────────────────────</w:t>
+      </w:r>
+    </w:p>
+    <w:p>
+      <w:pPr>
+        <w:spacing w:after="80"/>
+      </w:pPr>
+      <w:r>
+        <w:rPr>
+          <w:rFonts w:ascii="Times New Roman" w:hAnsi="Times New Roman"/>
+          <w:b/>
+          <w:sz w:val="20"/>
+        </w:rPr>
+        <w:t>Необходимые люди и материалы со стороны ООО «Химсервис»:</w:t>
+      </w:r>
+    </w:p>
+    <w:p>
+      <w:pPr>
+        <w:spacing w:after="80"/>
+      </w:pPr>
+      <w:r>
+        <w:rPr>
+          <w:rFonts w:ascii="Times New Roman" w:hAnsi="Times New Roman"/>
+          <w:b w:val="0"/>
+          <w:sz w:val="20"/>
+        </w:rPr>
+        <w:t>• Руководитель компании (Соколов Евгений Николаевич), главный бухгалтер, главный технолог — рабочая группа.</w:t>
+      </w:r>
+    </w:p>
+    <w:p>
+      <w:pPr>
+        <w:spacing w:after="80"/>
+      </w:pPr>
+      <w:r>
+        <w:rPr>
+          <w:rFonts w:ascii="Times New Roman" w:hAnsi="Times New Roman"/>
+          <w:b w:val="0"/>
+          <w:sz w:val="20"/>
+        </w:rPr>
+        <w:t>• Информация о продукции: описание, технические характеристики, чертежи.</w:t>
+      </w:r>
+    </w:p>
+    <w:p>
+      <w:pPr>
+        <w:spacing w:after="80"/>
+      </w:pPr>
+      <w:r>
+        <w:rPr>
+          <w:rFonts w:ascii="Times New Roman" w:hAnsi="Times New Roman"/>
+          <w:b w:val="0"/>
+          <w:sz w:val="20"/>
+        </w:rPr>
+        <w:t>• Описание технологии производства.</w:t>
+      </w:r>
+    </w:p>
+    <w:p>
+      <w:pPr>
+        <w:spacing w:after="80"/>
+      </w:pPr>
+      <w:r>
+        <w:rPr>
+          <w:rFonts w:ascii="Times New Roman" w:hAnsi="Times New Roman"/>
+          <w:b w:val="0"/>
+          <w:sz w:val="20"/>
+        </w:rPr>
+        <w:t>• Фото производства, оборудования, готовой продукции.</w:t>
+      </w:r>
+    </w:p>
+    <w:p>
+      <w:pPr>
+        <w:spacing w:after="80"/>
+      </w:pPr>
+      <w:r>
+        <w:rPr>
+          <w:rFonts w:ascii="Times New Roman" w:hAnsi="Times New Roman"/>
+          <w:b w:val="0"/>
+          <w:sz w:val="20"/>
+        </w:rPr>
+        <w:t>• 4–5 человек команды проекта: дипломы (техническое образование).</w:t>
+      </w:r>
+    </w:p>
+    <w:p>
+      <w:pPr>
+        <w:spacing w:after="80"/>
+      </w:pPr>
+      <w:r>
+        <w:rPr>
+          <w:rFonts w:ascii="Times New Roman" w:hAnsi="Times New Roman"/>
+          <w:b w:val="0"/>
+          <w:sz w:val="20"/>
+        </w:rPr>
+        <w:t>• Базовые цифры для экономической модели: себестоимость, покупатели, поставщики.</w:t>
+      </w:r>
+    </w:p>
+    <w:p>
+      <w:pPr>
+        <w:spacing w:after="80"/>
+      </w:pPr>
+      <w:r>
+        <w:rPr>
+          <w:rFonts w:ascii="Times New Roman" w:hAnsi="Times New Roman"/>
+          <w:b w:val="0"/>
+          <w:sz w:val="20"/>
+        </w:rPr>
+        <w:t>• Патенты (при наличии) или описание применяемых технологий.</w:t>
+      </w:r>
+    </w:p>
+    <w:p>
+      <w:pPr>
+        <w:spacing w:after="80"/>
+      </w:pPr>
+      <w:r>
+        <w:rPr>
+          <w:rFonts w:ascii="Times New Roman" w:hAnsi="Times New Roman"/>
+          <w:b w:val="0"/>
+          <w:sz w:val="8"/>
+        </w:rPr>
+      </w:r>
+    </w:p>
+    <w:p>
+      <w:pPr>
+        <w:spacing w:after="80"/>
+      </w:pPr>
+      <w:r>
+        <w:rPr>
+          <w:rFonts w:ascii="Times New Roman" w:hAnsi="Times New Roman"/>
+          <w:b/>
+          <w:sz w:val="20"/>
+        </w:rPr>
+        <w:t>Последовательность работ:</w:t>
+      </w:r>
+    </w:p>
+    <w:p>
+      <w:pPr>
+        <w:spacing w:after="80"/>
+      </w:pPr>
+      <w:r>
+        <w:rPr>
+          <w:rFonts w:ascii="Times New Roman" w:hAnsi="Times New Roman"/>
+          <w:b w:val="0"/>
+          <w:sz w:val="20"/>
+        </w:rPr>
+        <w:t>1. Согласование тематики заявки и предмета инновации — Устно с руководителем</w:t>
+      </w:r>
+    </w:p>
+    <w:p>
+      <w:pPr>
+        <w:spacing w:after="80"/>
+      </w:pPr>
+      <w:r>
+        <w:rPr>
+          <w:rFonts w:ascii="Times New Roman" w:hAnsi="Times New Roman"/>
+          <w:b w:val="0"/>
+          <w:sz w:val="20"/>
+        </w:rPr>
+        <w:t>2. Согласование и подписание договора</w:t>
+      </w:r>
+    </w:p>
+    <w:p>
+      <w:pPr>
+        <w:spacing w:after="80"/>
+      </w:pPr>
+      <w:r>
+        <w:rPr>
+          <w:rFonts w:ascii="Times New Roman" w:hAnsi="Times New Roman"/>
+          <w:b w:val="0"/>
+          <w:sz w:val="20"/>
+        </w:rPr>
+        <w:t>3. Авансовый платёж (250 000 ₽)</w:t>
+      </w:r>
+    </w:p>
+    <w:p>
+      <w:pPr>
+        <w:spacing w:after="80"/>
+      </w:pPr>
+      <w:r>
+        <w:rPr>
+          <w:rFonts w:ascii="Times New Roman" w:hAnsi="Times New Roman"/>
+          <w:b w:val="0"/>
+          <w:sz w:val="20"/>
+        </w:rPr>
+        <w:t>4. Формирование рабочей группы в Telegram/МАКС — Назначается главный аналитик</w:t>
+      </w:r>
+    </w:p>
+    <w:p>
+      <w:pPr>
+        <w:spacing w:after="80"/>
+      </w:pPr>
+      <w:r>
+        <w:rPr>
+          <w:rFonts w:ascii="Times New Roman" w:hAnsi="Times New Roman"/>
+          <w:b w:val="0"/>
+          <w:sz w:val="20"/>
+        </w:rPr>
+        <w:t>5. Сбор базовых документов + заявка на патент — 2–3 недели</w:t>
+      </w:r>
+    </w:p>
+    <w:p>
+      <w:pPr>
+        <w:spacing w:after="80"/>
+      </w:pPr>
+      <w:r>
+        <w:rPr>
+          <w:rFonts w:ascii="Times New Roman" w:hAnsi="Times New Roman"/>
+          <w:b w:val="0"/>
+          <w:sz w:val="20"/>
+        </w:rPr>
+        <w:t>6. Формирование и согласование заявки в Сколково — 3–4 дня на проверку</w:t>
+      </w:r>
+    </w:p>
+    <w:p>
+      <w:pPr>
+        <w:spacing w:after="80"/>
+      </w:pPr>
+      <w:r>
+        <w:rPr>
+          <w:rFonts w:ascii="Times New Roman" w:hAnsi="Times New Roman"/>
+          <w:b w:val="0"/>
+          <w:sz w:val="20"/>
+        </w:rPr>
+        <w:t>7. Подача заявки (экстерриториальный резидент)</w:t>
+      </w:r>
+    </w:p>
+    <w:p>
+      <w:pPr>
+        <w:spacing w:after="80"/>
+      </w:pPr>
+      <w:r>
+        <w:rPr>
+          <w:rFonts w:ascii="Times New Roman" w:hAnsi="Times New Roman"/>
+          <w:b w:val="0"/>
+          <w:sz w:val="20"/>
+        </w:rPr>
+        <w:t>8. Ожидание результатов экспертизы — 1–2 месяца</w:t>
+      </w:r>
+    </w:p>
+    <w:p>
+      <w:pPr>
+        <w:spacing w:after="80"/>
+      </w:pPr>
+      <w:r>
+        <w:rPr>
+          <w:rFonts w:ascii="Times New Roman" w:hAnsi="Times New Roman"/>
+          <w:b w:val="0"/>
+          <w:sz w:val="20"/>
+        </w:rPr>
+        <w:t>9. При отказе — доработка и переподача — 7–9 дней + ~1 месяц</w:t>
+      </w:r>
+    </w:p>
+    <w:p>
+      <w:pPr>
+        <w:spacing w:after="80"/>
+      </w:pPr>
+      <w:r>
+        <w:rPr>
+          <w:rFonts w:ascii="Times New Roman" w:hAnsi="Times New Roman"/>
+          <w:b w:val="0"/>
+          <w:sz w:val="20"/>
+        </w:rPr>
+        <w:t>10. Получение статуса резидента — Формальное письмо, 7–10 дней</w:t>
+      </w:r>
+    </w:p>
+    <w:p>
+      <w:pPr>
+        <w:spacing w:after="80"/>
+      </w:pPr>
+      <w:r>
+        <w:rPr>
+          <w:rFonts w:ascii="Times New Roman" w:hAnsi="Times New Roman"/>
+          <w:b w:val="0"/>
+          <w:sz w:val="20"/>
+        </w:rPr>
+        <w:t>11. Подача заявки на МТК — 10–15 дней после Сколково</w:t>
+      </w:r>
+    </w:p>
+    <w:p>
+      <w:pPr>
+        <w:spacing w:after="80"/>
+      </w:pPr>
+      <w:r>
+        <w:rPr>
+          <w:rFonts w:ascii="Times New Roman" w:hAnsi="Times New Roman"/>
+          <w:b w:val="0"/>
+          <w:sz w:val="8"/>
+        </w:rPr>
+      </w:r>
+    </w:p>
+    <w:p>
+      <w:pPr>
+        <w:spacing w:after="80"/>
+      </w:pPr>
+      <w:r>
+        <w:rPr>
+          <w:rFonts w:ascii="Times New Roman" w:hAnsi="Times New Roman"/>
+          <w:b w:val="0"/>
+          <w:sz w:val="20"/>
+        </w:rPr>
+        <w:t>После получения статуса — опционально: договор на ведение отчётности (4 квартальных + 1 годовой отчёт).</w:t>
+      </w:r>
+    </w:p>
+    <w:p>
+      <w:r>
+        <w:rPr>
+          <w:rFonts w:ascii="Times New Roman" w:hAnsi="Times New Roman"/>
+          <w:b/>
+          <w:sz w:val="24"/>
+        </w:rPr>
+        <w:br/>
+        <w:t>5. СТОИМОСТЬ УСЛУГ</w:t>
+      </w:r>
+    </w:p>
+    <w:p>
+      <w:r>
+        <w:rPr>
+          <w:color w:val="CCCCCC"/>
+          <w:sz w:val="12"/>
+        </w:rPr>
+        <w:t>──────────────────────────────────────────────────────────────────────</w:t>
+      </w:r>
+    </w:p>
+    <w:p>
+      <w:pPr>
+        <w:spacing w:after="80"/>
+      </w:pPr>
+      <w:r>
+        <w:rPr>
+          <w:rFonts w:ascii="Times New Roman" w:hAnsi="Times New Roman"/>
+          <w:b w:val="0"/>
+          <w:sz w:val="20"/>
+        </w:rPr>
+        <w:t>Мы предлагаем Вам комплексный пакет (Сколково + МТК + патент) на следующих условиях:</w:t>
       </w:r>
     </w:p>
     <w:tbl>
@@ -325,9 +907,14 @@
         <w:tc>
           <w:tcPr>
             <w:tcW w:type="dxa" w:w="4320"/>
+            <w:shd w:val="clear" w:color="auto" w:fill="1a1a2e"/>
           </w:tcPr>
           <w:p>
             <w:r>
+              <w:rPr>
+                <w:b/>
+                <w:color w:val="FFFFFF"/>
+              </w:rPr>
               <w:t>Услуга</w:t>
             </w:r>
           </w:p>
@@ -335,10 +922,15 @@
         <w:tc>
           <w:tcPr>
             <w:tcW w:type="dxa" w:w="4320"/>
+            <w:shd w:val="clear" w:color="auto" w:fill="1a1a2e"/>
           </w:tcPr>
           <w:p>
             <w:r>
-              <w:t>Стоимость</w:t>
+              <w:rPr>
+                <w:b/>
+                <w:color w:val="FFFFFF"/>
+              </w:rPr>
+              <w:t>Стоимость, ₽</w:t>
             </w:r>
           </w:p>
         </w:tc>
@@ -350,7 +942,7 @@
           </w:tcPr>
           <w:p>
             <w:r>
-              <w:t>Формирование пакета (аванс)</w:t>
+              <w:t>Формирование пакета документов (аванс)</w:t>
             </w:r>
           </w:p>
         </w:tc>
@@ -360,7 +952,7 @@
           </w:tcPr>
           <w:p>
             <w:r>
-              <w:t>250 000 ₽</w:t>
+              <w:t>250 000</w:t>
             </w:r>
           </w:p>
         </w:tc>
@@ -372,7 +964,7 @@
           </w:tcPr>
           <w:p>
             <w:r>
-              <w:t>Success fee Сколково</w:t>
+              <w:t>Вознаграждение за статус Сколково</w:t>
             </w:r>
           </w:p>
         </w:tc>
@@ -382,7 +974,7 @@
           </w:tcPr>
           <w:p>
             <w:r>
-              <w:t>500 000 ₽</w:t>
+              <w:t>500 000</w:t>
             </w:r>
           </w:p>
         </w:tc>
@@ -394,7 +986,7 @@
           </w:tcPr>
           <w:p>
             <w:r>
-              <w:t>Success fee МТК</w:t>
+              <w:t>Вознаграждение за включение в реестр МТК</w:t>
             </w:r>
           </w:p>
         </w:tc>
@@ -404,7 +996,7 @@
           </w:tcPr>
           <w:p>
             <w:r>
-              <w:t>150 000 ₽</w:t>
+              <w:t>150 000</w:t>
             </w:r>
           </w:p>
         </w:tc>
@@ -416,7 +1008,7 @@
           </w:tcPr>
           <w:p>
             <w:r>
-              <w:t>Патент (доп.)</w:t>
+              <w:t>Патент на полезную модель (дополнительно)</w:t>
             </w:r>
           </w:p>
         </w:tc>
@@ -426,36 +1018,385 @@
           </w:tcPr>
           <w:p>
             <w:r>
-              <w:t>80 000 ₽</w:t>
+              <w:t>80 000</w:t>
+            </w:r>
+          </w:p>
+        </w:tc>
+      </w:tr>
+      <w:tr>
+        <w:tc>
+          <w:tcPr>
+            <w:tcW w:type="dxa" w:w="4320"/>
+          </w:tcPr>
+          <w:p>
+            <w:r>
+              <w:t>ИТОГО (max)</w:t>
+            </w:r>
+          </w:p>
+        </w:tc>
+        <w:tc>
+          <w:tcPr>
+            <w:tcW w:type="dxa" w:w="4320"/>
+          </w:tcPr>
+          <w:p>
+            <w:r>
+              <w:t>980 000</w:t>
             </w:r>
           </w:p>
         </w:tc>
       </w:tr>
     </w:tbl>
-    <w:p/>
     <w:p>
+      <w:pPr>
+        <w:spacing w:after="80"/>
+      </w:pPr>
       <w:r>
         <w:rPr>
+          <w:rFonts w:ascii="Times New Roman" w:hAnsi="Times New Roman"/>
+          <w:b w:val="0"/>
+          <w:sz w:val="8"/>
+        </w:rPr>
+      </w:r>
+    </w:p>
+    <w:p>
+      <w:pPr>
+        <w:spacing w:after="80"/>
+      </w:pPr>
+      <w:r>
+        <w:rPr>
+          <w:rFonts w:ascii="Times New Roman" w:hAnsi="Times New Roman"/>
           <w:b/>
-          <w:sz w:val="24"/>
+          <w:sz w:val="20"/>
         </w:rPr>
-        <w:t>4. Дорожная карта</w:t>
+        <w:t>Условия:</w:t>
+      </w:r>
+    </w:p>
+    <w:p>
+      <w:pPr>
+        <w:spacing w:after="80"/>
+      </w:pPr>
+      <w:r>
+        <w:rPr>
+          <w:rFonts w:ascii="Times New Roman" w:hAnsi="Times New Roman"/>
+          <w:b w:val="0"/>
+          <w:sz w:val="20"/>
+        </w:rPr>
+        <w:t>• Договор на 3 подачи.</w:t>
+      </w:r>
+    </w:p>
+    <w:p>
+      <w:pPr>
+        <w:spacing w:after="80"/>
+      </w:pPr>
+      <w:r>
+        <w:rPr>
+          <w:rFonts w:ascii="Times New Roman" w:hAnsi="Times New Roman"/>
+          <w:b w:val="0"/>
+          <w:sz w:val="20"/>
+        </w:rPr>
+        <w:t>• Аванс — до начала работ.</w:t>
+      </w:r>
+    </w:p>
+    <w:p>
+      <w:pPr>
+        <w:spacing w:after="80"/>
+      </w:pPr>
+      <w:r>
+        <w:rPr>
+          <w:rFonts w:ascii="Times New Roman" w:hAnsi="Times New Roman"/>
+          <w:b w:val="0"/>
+          <w:sz w:val="20"/>
+        </w:rPr>
+        <w:t>• Вознаграждение — после получения протокола / включения в реестр МТК.</w:t>
+      </w:r>
+    </w:p>
+    <w:p>
+      <w:pPr>
+        <w:spacing w:after="80"/>
+      </w:pPr>
+      <w:r>
+        <w:rPr>
+          <w:rFonts w:ascii="Times New Roman" w:hAnsi="Times New Roman"/>
+          <w:b w:val="0"/>
+          <w:sz w:val="20"/>
+        </w:rPr>
+        <w:t>• НДС не облагается (УСН).</w:t>
       </w:r>
     </w:p>
     <w:p>
       <w:r>
         <w:rPr>
+          <w:rFonts w:ascii="Times New Roman" w:hAnsi="Times New Roman"/>
+          <w:b/>
+          <w:sz w:val="24"/>
+        </w:rPr>
+        <w:br/>
+        <w:t>6. ЧТО ПОЛУЧАЕТ КОМПАНИЯ</w:t>
+      </w:r>
+    </w:p>
+    <w:p>
+      <w:r>
+        <w:rPr>
+          <w:color w:val="CCCCCC"/>
+          <w:sz w:val="12"/>
+        </w:rPr>
+        <w:t>──────────────────────────────────────────────────────────────────────</w:t>
+      </w:r>
+    </w:p>
+    <w:p>
+      <w:pPr>
+        <w:spacing w:after="80"/>
+      </w:pPr>
+      <w:r>
+        <w:rPr>
+          <w:rFonts w:ascii="Times New Roman" w:hAnsi="Times New Roman"/>
+          <w:b/>
           <w:sz w:val="20"/>
         </w:rPr>
-        <w:t>1. Анализ компании — 1-2 дня</w:t>
-        <w:br/>
-        <w:t>2. Подача заявки в Сколково — 2-3 нед.</w:t>
-        <w:br/>
-        <w:t>3. Получение статуса — 2-3 мес.</w:t>
-        <w:br/>
-        <w:t>4. Патентование — 4-5 мес.</w:t>
-        <w:br/>
-        <w:t>5. Отчётность — ежеквартально</w:t>
+        <w:t>БЛОК I — Гарантированные льготы (без конкурсов):</w:t>
+      </w:r>
+    </w:p>
+    <w:p>
+      <w:pPr>
+        <w:spacing w:after="80"/>
+      </w:pPr>
+      <w:r>
+        <w:rPr>
+          <w:rFonts w:ascii="Times New Roman" w:hAnsi="Times New Roman"/>
+          <w:b w:val="0"/>
+          <w:sz w:val="20"/>
+        </w:rPr>
+        <w:t>• Налог на прибыль — 0% (на 10 лет)</w:t>
+      </w:r>
+    </w:p>
+    <w:p>
+      <w:pPr>
+        <w:spacing w:after="80"/>
+      </w:pPr>
+      <w:r>
+        <w:rPr>
+          <w:rFonts w:ascii="Times New Roman" w:hAnsi="Times New Roman"/>
+          <w:b w:val="0"/>
+          <w:sz w:val="20"/>
+        </w:rPr>
+        <w:t>• Налог на имущество — 0% (на 10 лет)</w:t>
+      </w:r>
+    </w:p>
+    <w:p>
+      <w:pPr>
+        <w:spacing w:after="80"/>
+      </w:pPr>
+      <w:r>
+        <w:rPr>
+          <w:rFonts w:ascii="Times New Roman" w:hAnsi="Times New Roman"/>
+          <w:b w:val="0"/>
+          <w:sz w:val="20"/>
+        </w:rPr>
+        <w:t>• Страховые взносы — 15% (на з/п свыше 1,5×МРОТ)</w:t>
+      </w:r>
+    </w:p>
+    <w:p>
+      <w:pPr>
+        <w:spacing w:after="80"/>
+      </w:pPr>
+      <w:r>
+        <w:rPr>
+          <w:rFonts w:ascii="Times New Roman" w:hAnsi="Times New Roman"/>
+          <w:b w:val="0"/>
+          <w:sz w:val="8"/>
+        </w:rPr>
+      </w:r>
+    </w:p>
+    <w:p>
+      <w:pPr>
+        <w:spacing w:after="80"/>
+      </w:pPr>
+      <w:r>
+        <w:rPr>
+          <w:rFonts w:ascii="Times New Roman" w:hAnsi="Times New Roman"/>
+          <w:b/>
+          <w:sz w:val="20"/>
+        </w:rPr>
+        <w:t>БЛОК II — Через конкурсы (гранты):</w:t>
+      </w:r>
+    </w:p>
+    <w:p>
+      <w:pPr>
+        <w:spacing w:after="80"/>
+      </w:pPr>
+      <w:r>
+        <w:rPr>
+          <w:rFonts w:ascii="Times New Roman" w:hAnsi="Times New Roman"/>
+          <w:b w:val="0"/>
+          <w:sz w:val="20"/>
+        </w:rPr>
+        <w:t>• Гранты Сколково от 1,5 до 50 млн ₽</w:t>
+      </w:r>
+    </w:p>
+    <w:p>
+      <w:pPr>
+        <w:spacing w:after="80"/>
+      </w:pPr>
+      <w:r>
+        <w:rPr>
+          <w:rFonts w:ascii="Times New Roman" w:hAnsi="Times New Roman"/>
+          <w:b w:val="0"/>
+          <w:sz w:val="20"/>
+        </w:rPr>
+        <w:t>• Дополнительные баллы в грантах ФСИ</w:t>
+      </w:r>
+    </w:p>
+    <w:p>
+      <w:pPr>
+        <w:spacing w:after="80"/>
+      </w:pPr>
+      <w:r>
+        <w:rPr>
+          <w:rFonts w:ascii="Times New Roman" w:hAnsi="Times New Roman"/>
+          <w:b w:val="0"/>
+          <w:sz w:val="20"/>
+        </w:rPr>
+        <w:t>• Ускоренная процедура МТК</w:t>
+      </w:r>
+    </w:p>
+    <w:p>
+      <w:pPr>
+        <w:spacing w:after="80"/>
+      </w:pPr>
+      <w:r>
+        <w:rPr>
+          <w:rFonts w:ascii="Times New Roman" w:hAnsi="Times New Roman"/>
+          <w:b w:val="0"/>
+          <w:sz w:val="8"/>
+        </w:rPr>
+      </w:r>
+    </w:p>
+    <w:p>
+      <w:pPr>
+        <w:spacing w:after="80"/>
+      </w:pPr>
+      <w:r>
+        <w:rPr>
+          <w:rFonts w:ascii="Times New Roman" w:hAnsi="Times New Roman"/>
+          <w:b/>
+          <w:sz w:val="20"/>
+        </w:rPr>
+        <w:t>БЛОК III — Бонусы МТК:</w:t>
+      </w:r>
+    </w:p>
+    <w:p>
+      <w:pPr>
+        <w:spacing w:after="80"/>
+      </w:pPr>
+      <w:r>
+        <w:rPr>
+          <w:rFonts w:ascii="Times New Roman" w:hAnsi="Times New Roman"/>
+          <w:b w:val="0"/>
+          <w:sz w:val="20"/>
+        </w:rPr>
+        <w:t>• Кредиты от 3% до 12% годовых</w:t>
+      </w:r>
+    </w:p>
+    <w:p>
+      <w:pPr>
+        <w:spacing w:after="80"/>
+      </w:pPr>
+      <w:r>
+        <w:rPr>
+          <w:rFonts w:ascii="Times New Roman" w:hAnsi="Times New Roman"/>
+          <w:b w:val="0"/>
+          <w:sz w:val="20"/>
+        </w:rPr>
+        <w:t>• Преимущества в торгах по 223-ФЗ и 44-ФЗ</w:t>
+      </w:r>
+    </w:p>
+    <w:p>
+      <w:pPr>
+        <w:spacing w:after="80"/>
+      </w:pPr>
+      <w:r>
+        <w:rPr>
+          <w:rFonts w:ascii="Times New Roman" w:hAnsi="Times New Roman"/>
+          <w:b w:val="0"/>
+          <w:sz w:val="20"/>
+        </w:rPr>
+        <w:t>• Размещение на «Витрине стартапов»</w:t>
+      </w:r>
+    </w:p>
+    <w:p>
+      <w:pPr>
+        <w:spacing w:after="80"/>
+      </w:pPr>
+      <w:r>
+        <w:rPr>
+          <w:rFonts w:ascii="Times New Roman" w:hAnsi="Times New Roman"/>
+          <w:b w:val="0"/>
+          <w:sz w:val="8"/>
+        </w:rPr>
+      </w:r>
+    </w:p>
+    <w:p>
+      <w:pPr>
+        <w:spacing w:after="80"/>
+      </w:pPr>
+      <w:r>
+        <w:rPr>
+          <w:rFonts w:ascii="Times New Roman" w:hAnsi="Times New Roman"/>
+          <w:b w:val="0"/>
+          <w:sz w:val="20"/>
+        </w:rPr>
+        <w:t>Будем рады ответить на Ваши вопросы по телефону +7 916 770-25-55 или info@andromedaconsult.ru. Благодарим за внимание!</w:t>
+      </w:r>
+    </w:p>
+    <w:p>
+      <w:pPr>
+        <w:spacing w:after="80"/>
+      </w:pPr>
+      <w:r>
+        <w:rPr>
+          <w:rFonts w:ascii="Times New Roman" w:hAnsi="Times New Roman"/>
+          <w:b w:val="0"/>
+          <w:sz w:val="8"/>
+        </w:rPr>
+      </w:r>
+    </w:p>
+    <w:p>
+      <w:pPr>
+        <w:spacing w:after="80"/>
+      </w:pPr>
+      <w:r>
+        <w:rPr>
+          <w:rFonts w:ascii="Times New Roman" w:hAnsi="Times New Roman"/>
+          <w:b w:val="0"/>
+          <w:sz w:val="20"/>
+        </w:rPr>
+        <w:t>С уважением,</w:t>
+      </w:r>
+    </w:p>
+    <w:p>
+      <w:pPr>
+        <w:spacing w:after="80"/>
+      </w:pPr>
+      <w:r>
+        <w:rPr>
+          <w:rFonts w:ascii="Times New Roman" w:hAnsi="Times New Roman"/>
+          <w:b/>
+          <w:sz w:val="22"/>
+        </w:rPr>
+        <w:t>Генеральный директор, Анна Наумова</w:t>
+      </w:r>
+    </w:p>
+    <w:p>
+      <w:pPr>
+        <w:spacing w:after="80"/>
+      </w:pPr>
+      <w:r>
+        <w:rPr>
+          <w:rFonts w:ascii="Times New Roman" w:hAnsi="Times New Roman"/>
+          <w:b w:val="0"/>
+          <w:sz w:val="20"/>
+        </w:rPr>
+        <w:t>ООО «Андромеда консалтинг»</w:t>
       </w:r>
     </w:p>
     <w:sectPr>
@@ -831,6 +1772,9 @@
     <w:name w:val="Normal"/>
     <w:qFormat/>
     <w:rsid w:val="00FC693F"/>
+    <w:pPr>
+      <w:spacing w:line="276" w:lineRule="auto"/>
+    </w:pPr>
     <w:rPr>
       <w:rFonts w:ascii="Times New Roman" w:hAnsi="Times New Roman"/>
       <w:sz w:val="22"/>

</xml_diff>